<commit_message>
fix(ui): allow AI key names to wrap and prevent truncation
</commit_message>
<xml_diff>
--- a/PANDUAN_INTEGRASI_SSO_ERP.docx
+++ b/PANDUAN_INTEGRASI_SSO_ERP.docx
@@ -398,7 +398,7 @@
           <w:rStyle w:val="HTMLCode"/>
           <w:lang w:val="id-ID"/>
         </w:rPr>
-        <w:t>https://chatbot-anda.com</w:t>
+        <w:t>http://74.48.112.31:5000</w:t>
       </w:r>
     </w:p>
     <w:p>
@@ -471,7 +471,23 @@
           <w:lang w:val="id-ID"/>
         </w:rPr>
         <w:lastRenderedPageBreak/>
-        <w:t>POST https://chatbot-anda.com/api/sso/generate-token</w:t>
+        <w:t xml:space="preserve">POST </w:t>
+      </w:r>
+      <w:bookmarkStart w:id="0" w:name="_Hlk229476191"/>
+      <w:r>
+        <w:rPr>
+          <w:rStyle w:val="HTMLCode"/>
+          <w:lang w:val="id-ID"/>
+        </w:rPr>
+        <w:t>http://74.48.112.31:5000</w:t>
+      </w:r>
+      <w:bookmarkEnd w:id="0"/>
+      <w:r>
+        <w:rPr>
+          <w:rStyle w:val="HTMLCode"/>
+          <w:lang w:val="id-ID"/>
+        </w:rPr>
+        <w:t>/api/sso/generate-token</w:t>
       </w:r>
     </w:p>
     <w:p>
@@ -620,6 +636,7 @@
                 <w:color w:val="333333"/>
               </w:rPr>
             </w:pPr>
+            <w:proofErr w:type="spellStart"/>
             <w:r>
               <w:rPr>
                 <w:rFonts w:ascii="Segoe UI" w:eastAsia="Times New Roman" w:hAnsi="Segoe UI" w:cs="Segoe UI"/>
@@ -628,6 +645,172 @@
                 <w:color w:val="333333"/>
               </w:rPr>
               <w:t>Keterangan</w:t>
+            </w:r>
+            <w:proofErr w:type="spellEnd"/>
+          </w:p>
+        </w:tc>
+      </w:tr>
+      <w:tr>
+        <w:trPr>
+          <w:divId w:val="555550595"/>
+        </w:trPr>
+        <w:tc>
+          <w:tcPr>
+            <w:tcW w:w="0" w:type="auto"/>
+            <w:tcBorders>
+              <w:top w:val="single" w:sz="6" w:space="0" w:color="DDDDDD"/>
+              <w:left w:val="single" w:sz="6" w:space="0" w:color="DDDDDD"/>
+              <w:bottom w:val="single" w:sz="6" w:space="0" w:color="DDDDDD"/>
+              <w:right w:val="single" w:sz="6" w:space="0" w:color="DDDDDD"/>
+            </w:tcBorders>
+            <w:tcMar>
+              <w:top w:w="180" w:type="dxa"/>
+              <w:left w:w="180" w:type="dxa"/>
+              <w:bottom w:w="180" w:type="dxa"/>
+              <w:right w:w="180" w:type="dxa"/>
+            </w:tcMar>
+            <w:vAlign w:val="center"/>
+            <w:hideMark/>
+          </w:tcPr>
+          <w:p>
+            <w:pPr>
+              <w:spacing w:before="300" w:after="300"/>
+              <w:rPr>
+                <w:rFonts w:ascii="Segoe UI" w:eastAsia="Times New Roman" w:hAnsi="Segoe UI" w:cs="Segoe UI"/>
+                <w:color w:val="333333"/>
+              </w:rPr>
+            </w:pPr>
+            <w:r>
+              <w:rPr>
+                <w:rStyle w:val="HTMLCode"/>
+              </w:rPr>
+              <w:t>X-SSO-KEY</w:t>
+            </w:r>
+          </w:p>
+        </w:tc>
+        <w:tc>
+          <w:tcPr>
+            <w:tcW w:w="0" w:type="auto"/>
+            <w:tcBorders>
+              <w:top w:val="single" w:sz="6" w:space="0" w:color="DDDDDD"/>
+              <w:left w:val="single" w:sz="6" w:space="0" w:color="DDDDDD"/>
+              <w:bottom w:val="single" w:sz="6" w:space="0" w:color="DDDDDD"/>
+              <w:right w:val="single" w:sz="6" w:space="0" w:color="DDDDDD"/>
+            </w:tcBorders>
+            <w:tcMar>
+              <w:top w:w="180" w:type="dxa"/>
+              <w:left w:w="180" w:type="dxa"/>
+              <w:bottom w:w="180" w:type="dxa"/>
+              <w:right w:w="180" w:type="dxa"/>
+            </w:tcMar>
+            <w:vAlign w:val="center"/>
+            <w:hideMark/>
+          </w:tcPr>
+          <w:p>
+            <w:pPr>
+              <w:spacing w:before="300" w:after="300"/>
+              <w:rPr>
+                <w:rFonts w:ascii="Segoe UI" w:eastAsia="Times New Roman" w:hAnsi="Segoe UI" w:cs="Segoe UI"/>
+                <w:color w:val="333333"/>
+              </w:rPr>
+            </w:pPr>
+            <w:r>
+              <w:rPr>
+                <w:rStyle w:val="HTMLCode"/>
+              </w:rPr>
+              <w:t>[SSO_API_KEY]</w:t>
+            </w:r>
+          </w:p>
+        </w:tc>
+        <w:tc>
+          <w:tcPr>
+            <w:tcW w:w="0" w:type="auto"/>
+            <w:tcBorders>
+              <w:top w:val="single" w:sz="6" w:space="0" w:color="DDDDDD"/>
+              <w:left w:val="single" w:sz="6" w:space="0" w:color="DDDDDD"/>
+              <w:bottom w:val="single" w:sz="6" w:space="0" w:color="DDDDDD"/>
+              <w:right w:val="single" w:sz="6" w:space="0" w:color="DDDDDD"/>
+            </w:tcBorders>
+            <w:tcMar>
+              <w:top w:w="180" w:type="dxa"/>
+              <w:left w:w="180" w:type="dxa"/>
+              <w:bottom w:w="180" w:type="dxa"/>
+              <w:right w:w="180" w:type="dxa"/>
+            </w:tcMar>
+            <w:vAlign w:val="center"/>
+            <w:hideMark/>
+          </w:tcPr>
+          <w:p>
+            <w:pPr>
+              <w:spacing w:before="300" w:after="300"/>
+              <w:rPr>
+                <w:rFonts w:ascii="Segoe UI" w:eastAsia="Times New Roman" w:hAnsi="Segoe UI" w:cs="Segoe UI"/>
+                <w:color w:val="333333"/>
+              </w:rPr>
+            </w:pPr>
+            <w:proofErr w:type="spellStart"/>
+            <w:r>
+              <w:rPr>
+                <w:rFonts w:ascii="Segoe UI" w:eastAsia="Times New Roman" w:hAnsi="Segoe UI" w:cs="Segoe UI"/>
+                <w:color w:val="333333"/>
+              </w:rPr>
+              <w:t>Kunci</w:t>
+            </w:r>
+            <w:proofErr w:type="spellEnd"/>
+            <w:r>
+              <w:rPr>
+                <w:rFonts w:ascii="Segoe UI" w:eastAsia="Times New Roman" w:hAnsi="Segoe UI" w:cs="Segoe UI"/>
+                <w:color w:val="333333"/>
+              </w:rPr>
+              <w:t xml:space="preserve"> </w:t>
+            </w:r>
+            <w:proofErr w:type="spellStart"/>
+            <w:r>
+              <w:rPr>
+                <w:rFonts w:ascii="Segoe UI" w:eastAsia="Times New Roman" w:hAnsi="Segoe UI" w:cs="Segoe UI"/>
+                <w:color w:val="333333"/>
+              </w:rPr>
+              <w:t>rahasia</w:t>
+            </w:r>
+            <w:proofErr w:type="spellEnd"/>
+            <w:r>
+              <w:rPr>
+                <w:rFonts w:ascii="Segoe UI" w:eastAsia="Times New Roman" w:hAnsi="Segoe UI" w:cs="Segoe UI"/>
+                <w:color w:val="333333"/>
+              </w:rPr>
+              <w:t xml:space="preserve"> </w:t>
+            </w:r>
+            <w:proofErr w:type="spellStart"/>
+            <w:r>
+              <w:rPr>
+                <w:rFonts w:ascii="Segoe UI" w:eastAsia="Times New Roman" w:hAnsi="Segoe UI" w:cs="Segoe UI"/>
+                <w:color w:val="333333"/>
+              </w:rPr>
+              <w:t>untuk</w:t>
+            </w:r>
+            <w:proofErr w:type="spellEnd"/>
+            <w:r>
+              <w:rPr>
+                <w:rFonts w:ascii="Segoe UI" w:eastAsia="Times New Roman" w:hAnsi="Segoe UI" w:cs="Segoe UI"/>
+                <w:color w:val="333333"/>
+              </w:rPr>
+              <w:t xml:space="preserve"> </w:t>
+            </w:r>
+            <w:proofErr w:type="spellStart"/>
+            <w:r>
+              <w:rPr>
+                <w:rFonts w:ascii="Segoe UI" w:eastAsia="Times New Roman" w:hAnsi="Segoe UI" w:cs="Segoe UI"/>
+                <w:color w:val="333333"/>
+              </w:rPr>
+              <w:t>otentikasi</w:t>
+            </w:r>
+            <w:proofErr w:type="spellEnd"/>
+            <w:r>
+              <w:rPr>
+                <w:rFonts w:ascii="Segoe UI" w:eastAsia="Times New Roman" w:hAnsi="Segoe UI" w:cs="Segoe UI"/>
+                <w:color w:val="333333"/>
+              </w:rPr>
+              <w:t xml:space="preserve"> server</w:t>
             </w:r>
           </w:p>
         </w:tc>
@@ -666,114 +849,6 @@
               <w:rPr>
                 <w:rStyle w:val="HTMLCode"/>
               </w:rPr>
-              <w:t>X-SSO-KEY</w:t>
-            </w:r>
-          </w:p>
-        </w:tc>
-        <w:tc>
-          <w:tcPr>
-            <w:tcW w:w="0" w:type="auto"/>
-            <w:tcBorders>
-              <w:top w:val="single" w:sz="6" w:space="0" w:color="DDDDDD"/>
-              <w:left w:val="single" w:sz="6" w:space="0" w:color="DDDDDD"/>
-              <w:bottom w:val="single" w:sz="6" w:space="0" w:color="DDDDDD"/>
-              <w:right w:val="single" w:sz="6" w:space="0" w:color="DDDDDD"/>
-            </w:tcBorders>
-            <w:tcMar>
-              <w:top w:w="180" w:type="dxa"/>
-              <w:left w:w="180" w:type="dxa"/>
-              <w:bottom w:w="180" w:type="dxa"/>
-              <w:right w:w="180" w:type="dxa"/>
-            </w:tcMar>
-            <w:vAlign w:val="center"/>
-            <w:hideMark/>
-          </w:tcPr>
-          <w:p>
-            <w:pPr>
-              <w:spacing w:before="300" w:after="300"/>
-              <w:rPr>
-                <w:rFonts w:ascii="Segoe UI" w:eastAsia="Times New Roman" w:hAnsi="Segoe UI" w:cs="Segoe UI"/>
-                <w:color w:val="333333"/>
-              </w:rPr>
-            </w:pPr>
-            <w:r>
-              <w:rPr>
-                <w:rStyle w:val="HTMLCode"/>
-              </w:rPr>
-              <w:t>[SSO_API_KEY]</w:t>
-            </w:r>
-          </w:p>
-        </w:tc>
-        <w:tc>
-          <w:tcPr>
-            <w:tcW w:w="0" w:type="auto"/>
-            <w:tcBorders>
-              <w:top w:val="single" w:sz="6" w:space="0" w:color="DDDDDD"/>
-              <w:left w:val="single" w:sz="6" w:space="0" w:color="DDDDDD"/>
-              <w:bottom w:val="single" w:sz="6" w:space="0" w:color="DDDDDD"/>
-              <w:right w:val="single" w:sz="6" w:space="0" w:color="DDDDDD"/>
-            </w:tcBorders>
-            <w:tcMar>
-              <w:top w:w="180" w:type="dxa"/>
-              <w:left w:w="180" w:type="dxa"/>
-              <w:bottom w:w="180" w:type="dxa"/>
-              <w:right w:w="180" w:type="dxa"/>
-            </w:tcMar>
-            <w:vAlign w:val="center"/>
-            <w:hideMark/>
-          </w:tcPr>
-          <w:p>
-            <w:pPr>
-              <w:spacing w:before="300" w:after="300"/>
-              <w:rPr>
-                <w:rFonts w:ascii="Segoe UI" w:eastAsia="Times New Roman" w:hAnsi="Segoe UI" w:cs="Segoe UI"/>
-                <w:color w:val="333333"/>
-              </w:rPr>
-            </w:pPr>
-            <w:r>
-              <w:rPr>
-                <w:rFonts w:ascii="Segoe UI" w:eastAsia="Times New Roman" w:hAnsi="Segoe UI" w:cs="Segoe UI"/>
-                <w:color w:val="333333"/>
-              </w:rPr>
-              <w:t>Kunci rahasia untuk otentikasi server</w:t>
-            </w:r>
-          </w:p>
-        </w:tc>
-      </w:tr>
-      <w:tr>
-        <w:trPr>
-          <w:divId w:val="555550595"/>
-        </w:trPr>
-        <w:tc>
-          <w:tcPr>
-            <w:tcW w:w="0" w:type="auto"/>
-            <w:tcBorders>
-              <w:top w:val="single" w:sz="6" w:space="0" w:color="DDDDDD"/>
-              <w:left w:val="single" w:sz="6" w:space="0" w:color="DDDDDD"/>
-              <w:bottom w:val="single" w:sz="6" w:space="0" w:color="DDDDDD"/>
-              <w:right w:val="single" w:sz="6" w:space="0" w:color="DDDDDD"/>
-            </w:tcBorders>
-            <w:tcMar>
-              <w:top w:w="180" w:type="dxa"/>
-              <w:left w:w="180" w:type="dxa"/>
-              <w:bottom w:w="180" w:type="dxa"/>
-              <w:right w:w="180" w:type="dxa"/>
-            </w:tcMar>
-            <w:vAlign w:val="center"/>
-            <w:hideMark/>
-          </w:tcPr>
-          <w:p>
-            <w:pPr>
-              <w:spacing w:before="300" w:after="300"/>
-              <w:rPr>
-                <w:rFonts w:ascii="Segoe UI" w:eastAsia="Times New Roman" w:hAnsi="Segoe UI" w:cs="Segoe UI"/>
-                <w:color w:val="333333"/>
-              </w:rPr>
-            </w:pPr>
-            <w:r>
-              <w:rPr>
-                <w:rStyle w:val="HTMLCode"/>
-              </w:rPr>
               <w:t>Accept</w:t>
             </w:r>
           </w:p>
@@ -808,8 +883,16 @@
               <w:rPr>
                 <w:rStyle w:val="HTMLCode"/>
               </w:rPr>
-              <w:t>application/json</w:t>
+              <w:t>application/</w:t>
             </w:r>
+            <w:proofErr w:type="spellStart"/>
+            <w:r>
+              <w:rPr>
+                <w:rStyle w:val="HTMLCode"/>
+              </w:rPr>
+              <w:t>json</w:t>
+            </w:r>
+            <w:proofErr w:type="spellEnd"/>
           </w:p>
         </w:tc>
         <w:tc>
@@ -843,8 +926,33 @@
                 <w:rFonts w:ascii="Segoe UI" w:eastAsia="Times New Roman" w:hAnsi="Segoe UI" w:cs="Segoe UI"/>
                 <w:color w:val="333333"/>
               </w:rPr>
-              <w:t>Format respon yang diinginkan</w:t>
+              <w:t xml:space="preserve">Format </w:t>
             </w:r>
+            <w:proofErr w:type="spellStart"/>
+            <w:r>
+              <w:rPr>
+                <w:rFonts w:ascii="Segoe UI" w:eastAsia="Times New Roman" w:hAnsi="Segoe UI" w:cs="Segoe UI"/>
+                <w:color w:val="333333"/>
+              </w:rPr>
+              <w:t>respon</w:t>
+            </w:r>
+            <w:proofErr w:type="spellEnd"/>
+            <w:r>
+              <w:rPr>
+                <w:rFonts w:ascii="Segoe UI" w:eastAsia="Times New Roman" w:hAnsi="Segoe UI" w:cs="Segoe UI"/>
+                <w:color w:val="333333"/>
+              </w:rPr>
+              <w:t xml:space="preserve"> yang </w:t>
+            </w:r>
+            <w:proofErr w:type="spellStart"/>
+            <w:r>
+              <w:rPr>
+                <w:rFonts w:ascii="Segoe UI" w:eastAsia="Times New Roman" w:hAnsi="Segoe UI" w:cs="Segoe UI"/>
+                <w:color w:val="333333"/>
+              </w:rPr>
+              <w:t>diinginkan</w:t>
+            </w:r>
+            <w:proofErr w:type="spellEnd"/>
           </w:p>
         </w:tc>
       </w:tr>
@@ -1036,6 +1144,7 @@
                 <w:color w:val="333333"/>
               </w:rPr>
             </w:pPr>
+            <w:proofErr w:type="spellStart"/>
             <w:r>
               <w:rPr>
                 <w:rFonts w:ascii="Segoe UI" w:eastAsia="Times New Roman" w:hAnsi="Segoe UI" w:cs="Segoe UI"/>
@@ -1044,6 +1153,199 @@
                 <w:color w:val="333333"/>
               </w:rPr>
               <w:t>Keterangan</w:t>
+            </w:r>
+            <w:proofErr w:type="spellEnd"/>
+          </w:p>
+        </w:tc>
+      </w:tr>
+      <w:tr>
+        <w:trPr>
+          <w:divId w:val="555550595"/>
+        </w:trPr>
+        <w:tc>
+          <w:tcPr>
+            <w:tcW w:w="0" w:type="auto"/>
+            <w:tcBorders>
+              <w:top w:val="single" w:sz="6" w:space="0" w:color="DDDDDD"/>
+              <w:left w:val="single" w:sz="6" w:space="0" w:color="DDDDDD"/>
+              <w:bottom w:val="single" w:sz="6" w:space="0" w:color="DDDDDD"/>
+              <w:right w:val="single" w:sz="6" w:space="0" w:color="DDDDDD"/>
+            </w:tcBorders>
+            <w:tcMar>
+              <w:top w:w="180" w:type="dxa"/>
+              <w:left w:w="180" w:type="dxa"/>
+              <w:bottom w:w="180" w:type="dxa"/>
+              <w:right w:w="180" w:type="dxa"/>
+            </w:tcMar>
+            <w:vAlign w:val="center"/>
+            <w:hideMark/>
+          </w:tcPr>
+          <w:p>
+            <w:pPr>
+              <w:spacing w:before="300" w:after="300"/>
+              <w:rPr>
+                <w:rFonts w:ascii="Segoe UI" w:eastAsia="Times New Roman" w:hAnsi="Segoe UI" w:cs="Segoe UI"/>
+                <w:color w:val="333333"/>
+              </w:rPr>
+            </w:pPr>
+            <w:r>
+              <w:rPr>
+                <w:rStyle w:val="HTMLCode"/>
+              </w:rPr>
+              <w:t>email</w:t>
+            </w:r>
+          </w:p>
+        </w:tc>
+        <w:tc>
+          <w:tcPr>
+            <w:tcW w:w="0" w:type="auto"/>
+            <w:tcBorders>
+              <w:top w:val="single" w:sz="6" w:space="0" w:color="DDDDDD"/>
+              <w:left w:val="single" w:sz="6" w:space="0" w:color="DDDDDD"/>
+              <w:bottom w:val="single" w:sz="6" w:space="0" w:color="DDDDDD"/>
+              <w:right w:val="single" w:sz="6" w:space="0" w:color="DDDDDD"/>
+            </w:tcBorders>
+            <w:tcMar>
+              <w:top w:w="180" w:type="dxa"/>
+              <w:left w:w="180" w:type="dxa"/>
+              <w:bottom w:w="180" w:type="dxa"/>
+              <w:right w:w="180" w:type="dxa"/>
+            </w:tcMar>
+            <w:vAlign w:val="center"/>
+            <w:hideMark/>
+          </w:tcPr>
+          <w:p>
+            <w:pPr>
+              <w:spacing w:before="300" w:after="300"/>
+              <w:rPr>
+                <w:rFonts w:ascii="Segoe UI" w:eastAsia="Times New Roman" w:hAnsi="Segoe UI" w:cs="Segoe UI"/>
+                <w:color w:val="333333"/>
+              </w:rPr>
+            </w:pPr>
+            <w:r>
+              <w:rPr>
+                <w:rStyle w:val="HTMLCode"/>
+              </w:rPr>
+              <w:t>string</w:t>
+            </w:r>
+          </w:p>
+        </w:tc>
+        <w:tc>
+          <w:tcPr>
+            <w:tcW w:w="0" w:type="auto"/>
+            <w:tcBorders>
+              <w:top w:val="single" w:sz="6" w:space="0" w:color="DDDDDD"/>
+              <w:left w:val="single" w:sz="6" w:space="0" w:color="DDDDDD"/>
+              <w:bottom w:val="single" w:sz="6" w:space="0" w:color="DDDDDD"/>
+              <w:right w:val="single" w:sz="6" w:space="0" w:color="DDDDDD"/>
+            </w:tcBorders>
+            <w:tcMar>
+              <w:top w:w="180" w:type="dxa"/>
+              <w:left w:w="180" w:type="dxa"/>
+              <w:bottom w:w="180" w:type="dxa"/>
+              <w:right w:w="180" w:type="dxa"/>
+            </w:tcMar>
+            <w:vAlign w:val="center"/>
+            <w:hideMark/>
+          </w:tcPr>
+          <w:p>
+            <w:pPr>
+              <w:spacing w:before="300" w:after="300"/>
+              <w:rPr>
+                <w:rFonts w:ascii="Segoe UI" w:eastAsia="Times New Roman" w:hAnsi="Segoe UI" w:cs="Segoe UI"/>
+                <w:color w:val="333333"/>
+              </w:rPr>
+            </w:pPr>
+            <w:r>
+              <w:rPr>
+                <w:rStyle w:val="Strong"/>
+                <w:rFonts w:ascii="Segoe UI" w:eastAsia="Times New Roman" w:hAnsi="Segoe UI" w:cs="Segoe UI"/>
+                <w:color w:val="333333"/>
+              </w:rPr>
+              <w:t>Ya</w:t>
+            </w:r>
+          </w:p>
+        </w:tc>
+        <w:tc>
+          <w:tcPr>
+            <w:tcW w:w="0" w:type="auto"/>
+            <w:tcBorders>
+              <w:top w:val="single" w:sz="6" w:space="0" w:color="DDDDDD"/>
+              <w:left w:val="single" w:sz="6" w:space="0" w:color="DDDDDD"/>
+              <w:bottom w:val="single" w:sz="6" w:space="0" w:color="DDDDDD"/>
+              <w:right w:val="single" w:sz="6" w:space="0" w:color="DDDDDD"/>
+            </w:tcBorders>
+            <w:tcMar>
+              <w:top w:w="180" w:type="dxa"/>
+              <w:left w:w="180" w:type="dxa"/>
+              <w:bottom w:w="180" w:type="dxa"/>
+              <w:right w:w="180" w:type="dxa"/>
+            </w:tcMar>
+            <w:vAlign w:val="center"/>
+            <w:hideMark/>
+          </w:tcPr>
+          <w:p>
+            <w:pPr>
+              <w:spacing w:before="300" w:after="300"/>
+              <w:rPr>
+                <w:rFonts w:ascii="Segoe UI" w:eastAsia="Times New Roman" w:hAnsi="Segoe UI" w:cs="Segoe UI"/>
+                <w:color w:val="333333"/>
+              </w:rPr>
+            </w:pPr>
+            <w:r>
+              <w:rPr>
+                <w:rFonts w:ascii="Segoe UI" w:eastAsia="Times New Roman" w:hAnsi="Segoe UI" w:cs="Segoe UI"/>
+                <w:color w:val="333333"/>
+              </w:rPr>
+              <w:t xml:space="preserve">Email </w:t>
+            </w:r>
+            <w:proofErr w:type="spellStart"/>
+            <w:r>
+              <w:rPr>
+                <w:rFonts w:ascii="Segoe UI" w:eastAsia="Times New Roman" w:hAnsi="Segoe UI" w:cs="Segoe UI"/>
+                <w:color w:val="333333"/>
+              </w:rPr>
+              <w:t>unik</w:t>
+            </w:r>
+            <w:proofErr w:type="spellEnd"/>
+            <w:r>
+              <w:rPr>
+                <w:rFonts w:ascii="Segoe UI" w:eastAsia="Times New Roman" w:hAnsi="Segoe UI" w:cs="Segoe UI"/>
+                <w:color w:val="333333"/>
+              </w:rPr>
+              <w:t xml:space="preserve"> user (</w:t>
+            </w:r>
+            <w:proofErr w:type="spellStart"/>
+            <w:r>
+              <w:rPr>
+                <w:rFonts w:ascii="Segoe UI" w:eastAsia="Times New Roman" w:hAnsi="Segoe UI" w:cs="Segoe UI"/>
+                <w:color w:val="333333"/>
+              </w:rPr>
+              <w:t>sebagai</w:t>
+            </w:r>
+            <w:proofErr w:type="spellEnd"/>
+            <w:r>
+              <w:rPr>
+                <w:rFonts w:ascii="Segoe UI" w:eastAsia="Times New Roman" w:hAnsi="Segoe UI" w:cs="Segoe UI"/>
+                <w:color w:val="333333"/>
+              </w:rPr>
+              <w:t xml:space="preserve"> ID </w:t>
+            </w:r>
+            <w:proofErr w:type="spellStart"/>
+            <w:r>
+              <w:rPr>
+                <w:rFonts w:ascii="Segoe UI" w:eastAsia="Times New Roman" w:hAnsi="Segoe UI" w:cs="Segoe UI"/>
+                <w:color w:val="333333"/>
+              </w:rPr>
+              <w:t>utama</w:t>
+            </w:r>
+            <w:proofErr w:type="spellEnd"/>
+            <w:r>
+              <w:rPr>
+                <w:rFonts w:ascii="Segoe UI" w:eastAsia="Times New Roman" w:hAnsi="Segoe UI" w:cs="Segoe UI"/>
+                <w:color w:val="333333"/>
+              </w:rPr>
+              <w:t>)</w:t>
             </w:r>
           </w:p>
         </w:tc>
@@ -1082,7 +1384,7 @@
               <w:rPr>
                 <w:rStyle w:val="HTMLCode"/>
               </w:rPr>
-              <w:t>email</w:t>
+              <w:t>name</w:t>
             </w:r>
           </w:p>
         </w:tc>
@@ -1187,7 +1489,55 @@
                 <w:rFonts w:ascii="Segoe UI" w:eastAsia="Times New Roman" w:hAnsi="Segoe UI" w:cs="Segoe UI"/>
                 <w:color w:val="333333"/>
               </w:rPr>
-              <w:t>Email unik user (sebagai ID utama)</w:t>
+              <w:t xml:space="preserve">Nama </w:t>
+            </w:r>
+            <w:proofErr w:type="spellStart"/>
+            <w:r>
+              <w:rPr>
+                <w:rFonts w:ascii="Segoe UI" w:eastAsia="Times New Roman" w:hAnsi="Segoe UI" w:cs="Segoe UI"/>
+                <w:color w:val="333333"/>
+              </w:rPr>
+              <w:t>lengkap</w:t>
+            </w:r>
+            <w:proofErr w:type="spellEnd"/>
+            <w:r>
+              <w:rPr>
+                <w:rFonts w:ascii="Segoe UI" w:eastAsia="Times New Roman" w:hAnsi="Segoe UI" w:cs="Segoe UI"/>
+                <w:color w:val="333333"/>
+              </w:rPr>
+              <w:t xml:space="preserve"> user (</w:t>
+            </w:r>
+            <w:proofErr w:type="spellStart"/>
+            <w:r>
+              <w:rPr>
+                <w:rFonts w:ascii="Segoe UI" w:eastAsia="Times New Roman" w:hAnsi="Segoe UI" w:cs="Segoe UI"/>
+                <w:color w:val="333333"/>
+              </w:rPr>
+              <w:t>untuk</w:t>
+            </w:r>
+            <w:proofErr w:type="spellEnd"/>
+            <w:r>
+              <w:rPr>
+                <w:rFonts w:ascii="Segoe UI" w:eastAsia="Times New Roman" w:hAnsi="Segoe UI" w:cs="Segoe UI"/>
+                <w:color w:val="333333"/>
+              </w:rPr>
+              <w:t xml:space="preserve"> </w:t>
+            </w:r>
+            <w:proofErr w:type="spellStart"/>
+            <w:r>
+              <w:rPr>
+                <w:rFonts w:ascii="Segoe UI" w:eastAsia="Times New Roman" w:hAnsi="Segoe UI" w:cs="Segoe UI"/>
+                <w:color w:val="333333"/>
+              </w:rPr>
+              <w:t>tampilan</w:t>
+            </w:r>
+            <w:proofErr w:type="spellEnd"/>
+            <w:r>
+              <w:rPr>
+                <w:rFonts w:ascii="Segoe UI" w:eastAsia="Times New Roman" w:hAnsi="Segoe UI" w:cs="Segoe UI"/>
+                <w:color w:val="333333"/>
+              </w:rPr>
+              <w:t>)</w:t>
             </w:r>
           </w:p>
         </w:tc>
@@ -1222,12 +1572,14 @@
                 <w:color w:val="333333"/>
               </w:rPr>
             </w:pPr>
+            <w:proofErr w:type="spellStart"/>
             <w:r>
               <w:rPr>
                 <w:rStyle w:val="HTMLCode"/>
               </w:rPr>
-              <w:t>name</w:t>
+              <w:t>erp_user_id</w:t>
             </w:r>
+            <w:proofErr w:type="spellEnd"/>
           </w:p>
         </w:tc>
         <w:tc>
@@ -1290,14 +1642,15 @@
                 <w:color w:val="333333"/>
               </w:rPr>
             </w:pPr>
+            <w:proofErr w:type="spellStart"/>
             <w:r>
               <w:rPr>
-                <w:rStyle w:val="Strong"/>
-                <w:rFonts w:ascii="Segoe UI" w:eastAsia="Times New Roman" w:hAnsi="Segoe UI" w:cs="Segoe UI"/>
-                <w:color w:val="333333"/>
-              </w:rPr>
-              <w:t>Ya</w:t>
+                <w:rFonts w:ascii="Segoe UI" w:eastAsia="Times New Roman" w:hAnsi="Segoe UI" w:cs="Segoe UI"/>
+                <w:color w:val="333333"/>
+              </w:rPr>
+              <w:t>Tidak</w:t>
             </w:r>
+            <w:proofErr w:type="spellEnd"/>
           </w:p>
         </w:tc>
         <w:tc>
@@ -1331,150 +1684,23 @@
                 <w:rFonts w:ascii="Segoe UI" w:eastAsia="Times New Roman" w:hAnsi="Segoe UI" w:cs="Segoe UI"/>
                 <w:color w:val="333333"/>
               </w:rPr>
-              <w:t>Nama lengkap user (untuk tampilan)</w:t>
+              <w:t xml:space="preserve">ID internal user di </w:t>
             </w:r>
-          </w:p>
-        </w:tc>
-      </w:tr>
-      <w:tr>
-        <w:trPr>
-          <w:divId w:val="555550595"/>
-        </w:trPr>
-        <w:tc>
-          <w:tcPr>
-            <w:tcW w:w="0" w:type="auto"/>
-            <w:tcBorders>
-              <w:top w:val="single" w:sz="6" w:space="0" w:color="DDDDDD"/>
-              <w:left w:val="single" w:sz="6" w:space="0" w:color="DDDDDD"/>
-              <w:bottom w:val="single" w:sz="6" w:space="0" w:color="DDDDDD"/>
-              <w:right w:val="single" w:sz="6" w:space="0" w:color="DDDDDD"/>
-            </w:tcBorders>
-            <w:tcMar>
-              <w:top w:w="180" w:type="dxa"/>
-              <w:left w:w="180" w:type="dxa"/>
-              <w:bottom w:w="180" w:type="dxa"/>
-              <w:right w:w="180" w:type="dxa"/>
-            </w:tcMar>
-            <w:vAlign w:val="center"/>
-            <w:hideMark/>
-          </w:tcPr>
-          <w:p>
-            <w:pPr>
-              <w:spacing w:before="300" w:after="300"/>
-              <w:rPr>
-                <w:rFonts w:ascii="Segoe UI" w:eastAsia="Times New Roman" w:hAnsi="Segoe UI" w:cs="Segoe UI"/>
-                <w:color w:val="333333"/>
-              </w:rPr>
-            </w:pPr>
+            <w:proofErr w:type="spellStart"/>
             <w:r>
               <w:rPr>
-                <w:rStyle w:val="HTMLCode"/>
-              </w:rPr>
-              <w:t>erp_user_id</w:t>
+                <w:rFonts w:ascii="Segoe UI" w:eastAsia="Times New Roman" w:hAnsi="Segoe UI" w:cs="Segoe UI"/>
+                <w:color w:val="333333"/>
+              </w:rPr>
+              <w:t>sistem</w:t>
             </w:r>
-          </w:p>
-        </w:tc>
-        <w:tc>
-          <w:tcPr>
-            <w:tcW w:w="0" w:type="auto"/>
-            <w:tcBorders>
-              <w:top w:val="single" w:sz="6" w:space="0" w:color="DDDDDD"/>
-              <w:left w:val="single" w:sz="6" w:space="0" w:color="DDDDDD"/>
-              <w:bottom w:val="single" w:sz="6" w:space="0" w:color="DDDDDD"/>
-              <w:right w:val="single" w:sz="6" w:space="0" w:color="DDDDDD"/>
-            </w:tcBorders>
-            <w:tcMar>
-              <w:top w:w="180" w:type="dxa"/>
-              <w:left w:w="180" w:type="dxa"/>
-              <w:bottom w:w="180" w:type="dxa"/>
-              <w:right w:w="180" w:type="dxa"/>
-            </w:tcMar>
-            <w:vAlign w:val="center"/>
-            <w:hideMark/>
-          </w:tcPr>
-          <w:p>
-            <w:pPr>
-              <w:spacing w:before="300" w:after="300"/>
-              <w:rPr>
-                <w:rFonts w:ascii="Segoe UI" w:eastAsia="Times New Roman" w:hAnsi="Segoe UI" w:cs="Segoe UI"/>
-                <w:color w:val="333333"/>
-              </w:rPr>
-            </w:pPr>
+            <w:proofErr w:type="spellEnd"/>
             <w:r>
               <w:rPr>
-                <w:rStyle w:val="HTMLCode"/>
-              </w:rPr>
-              <w:t>string</w:t>
-            </w:r>
-          </w:p>
-        </w:tc>
-        <w:tc>
-          <w:tcPr>
-            <w:tcW w:w="0" w:type="auto"/>
-            <w:tcBorders>
-              <w:top w:val="single" w:sz="6" w:space="0" w:color="DDDDDD"/>
-              <w:left w:val="single" w:sz="6" w:space="0" w:color="DDDDDD"/>
-              <w:bottom w:val="single" w:sz="6" w:space="0" w:color="DDDDDD"/>
-              <w:right w:val="single" w:sz="6" w:space="0" w:color="DDDDDD"/>
-            </w:tcBorders>
-            <w:tcMar>
-              <w:top w:w="180" w:type="dxa"/>
-              <w:left w:w="180" w:type="dxa"/>
-              <w:bottom w:w="180" w:type="dxa"/>
-              <w:right w:w="180" w:type="dxa"/>
-            </w:tcMar>
-            <w:vAlign w:val="center"/>
-            <w:hideMark/>
-          </w:tcPr>
-          <w:p>
-            <w:pPr>
-              <w:spacing w:before="300" w:after="300"/>
-              <w:rPr>
-                <w:rFonts w:ascii="Segoe UI" w:eastAsia="Times New Roman" w:hAnsi="Segoe UI" w:cs="Segoe UI"/>
-                <w:color w:val="333333"/>
-              </w:rPr>
-            </w:pPr>
-            <w:r>
-              <w:rPr>
-                <w:rFonts w:ascii="Segoe UI" w:eastAsia="Times New Roman" w:hAnsi="Segoe UI" w:cs="Segoe UI"/>
-                <w:color w:val="333333"/>
-              </w:rPr>
-              <w:t>Tidak</w:t>
-            </w:r>
-          </w:p>
-        </w:tc>
-        <w:tc>
-          <w:tcPr>
-            <w:tcW w:w="0" w:type="auto"/>
-            <w:tcBorders>
-              <w:top w:val="single" w:sz="6" w:space="0" w:color="DDDDDD"/>
-              <w:left w:val="single" w:sz="6" w:space="0" w:color="DDDDDD"/>
-              <w:bottom w:val="single" w:sz="6" w:space="0" w:color="DDDDDD"/>
-              <w:right w:val="single" w:sz="6" w:space="0" w:color="DDDDDD"/>
-            </w:tcBorders>
-            <w:tcMar>
-              <w:top w:w="180" w:type="dxa"/>
-              <w:left w:w="180" w:type="dxa"/>
-              <w:bottom w:w="180" w:type="dxa"/>
-              <w:right w:w="180" w:type="dxa"/>
-            </w:tcMar>
-            <w:vAlign w:val="center"/>
-            <w:hideMark/>
-          </w:tcPr>
-          <w:p>
-            <w:pPr>
-              <w:spacing w:before="300" w:after="300"/>
-              <w:rPr>
-                <w:rFonts w:ascii="Segoe UI" w:eastAsia="Times New Roman" w:hAnsi="Segoe UI" w:cs="Segoe UI"/>
-                <w:color w:val="333333"/>
-              </w:rPr>
-            </w:pPr>
-            <w:r>
-              <w:rPr>
-                <w:rFonts w:ascii="Segoe UI" w:eastAsia="Times New Roman" w:hAnsi="Segoe UI" w:cs="Segoe UI"/>
-                <w:color w:val="333333"/>
-              </w:rPr>
-              <w:t>ID internal user di sistem ERP</w:t>
+                <w:rFonts w:ascii="Segoe UI" w:eastAsia="Times New Roman" w:hAnsi="Segoe UI" w:cs="Segoe UI"/>
+                <w:color w:val="333333"/>
+              </w:rPr>
+              <w:t xml:space="preserve"> ERP</w:t>
             </w:r>
           </w:p>
         </w:tc>
@@ -1489,11 +1715,32 @@
           <w:lang w:val="id-ID"/>
         </w:rPr>
       </w:pPr>
-      <w:r>
-        <w:rPr>
-          <w:rFonts w:ascii="Segoe UI" w:eastAsia="Times New Roman" w:hAnsi="Segoe UI" w:cs="Segoe UI"/>
-          <w:lang w:val="id-ID"/>
-        </w:rPr>
+    </w:p>
+    <w:p>
+      <w:pPr>
+        <w:pStyle w:val="Heading3"/>
+        <w:divId w:val="555550595"/>
+        <w:rPr>
+          <w:rFonts w:ascii="Segoe UI" w:eastAsia="Times New Roman" w:hAnsi="Segoe UI" w:cs="Segoe UI"/>
+          <w:lang w:val="id-ID"/>
+        </w:rPr>
+      </w:pPr>
+    </w:p>
+    <w:p>
+      <w:pPr>
+        <w:pStyle w:val="Heading3"/>
+        <w:divId w:val="555550595"/>
+        <w:rPr>
+          <w:rFonts w:ascii="Segoe UI" w:eastAsia="Times New Roman" w:hAnsi="Segoe UI" w:cs="Segoe UI"/>
+          <w:lang w:val="id-ID"/>
+        </w:rPr>
+      </w:pPr>
+      <w:r>
+        <w:rPr>
+          <w:rFonts w:ascii="Segoe UI" w:eastAsia="Times New Roman" w:hAnsi="Segoe UI" w:cs="Segoe UI"/>
+          <w:lang w:val="id-ID"/>
+        </w:rPr>
+        <w:lastRenderedPageBreak/>
         <w:t>Contoh Request (PHP/Laravel)</w:t>
       </w:r>
     </w:p>
@@ -1548,7 +1795,6 @@
         <w:rPr>
           <w:lang w:val="id-ID"/>
         </w:rPr>
-        <w:lastRenderedPageBreak/>
         <w:t xml:space="preserve">    'Accept' =&gt; 'application/json',</w:t>
       </w:r>
     </w:p>
@@ -1564,7 +1810,19 @@
         <w:rPr>
           <w:lang w:val="id-ID"/>
         </w:rPr>
-        <w:t>])-&gt;post('https://chatbot-anda.com/api/sso/generate-token', [</w:t>
+        <w:t>])-&gt;post('</w:t>
+      </w:r>
+      <w:r>
+        <w:rPr>
+          <w:lang w:val="id-ID"/>
+        </w:rPr>
+        <w:t>http://74.48.112.31:5000</w:t>
+      </w:r>
+      <w:r>
+        <w:rPr>
+          <w:lang w:val="id-ID"/>
+        </w:rPr>
+        <w:t>/api/sso/generate-token', [</w:t>
       </w:r>
     </w:p>
     <w:p>
@@ -1771,7 +2029,14 @@
           <w:rStyle w:val="HTMLCode"/>
           <w:lang w:val="id-ID"/>
         </w:rPr>
-        <w:t>https://chatbot-anda.com/auth/sso?token=[OTT_TOKEN]</w:t>
+        <w:t>http://74.48.112.31:5000</w:t>
+      </w:r>
+      <w:r>
+        <w:rPr>
+          <w:rStyle w:val="HTMLCode"/>
+          <w:lang w:val="id-ID"/>
+        </w:rPr>
+        <w:t>/auth/sso?token=[OTT_TOKEN]</w:t>
       </w:r>
     </w:p>
     <w:p>
@@ -2046,6 +2311,7 @@
           <w:color w:val="333333"/>
           <w:lang w:val="id-ID"/>
         </w:rPr>
+        <w:lastRenderedPageBreak/>
         <w:t xml:space="preserve">Admin Chatbot tetap memegang kendali penuh melalui </w:t>
       </w:r>
       <w:r>
@@ -2081,7 +2347,6 @@
           <w:color w:val="333333"/>
           <w:lang w:val="id-ID"/>
         </w:rPr>
-        <w:lastRenderedPageBreak/>
         <w:pict w14:anchorId="224E899E">
           <v:rect id="_x0000_i1030" style="width:0;height:1.5pt" o:hralign="center" o:hrstd="t" o:hr="t" fillcolor="#a0a0a0" stroked="f"/>
         </w:pict>
@@ -2096,6 +2361,7 @@
           <w:lang w:val="id-ID"/>
         </w:rPr>
       </w:pPr>
+      <w:bookmarkStart w:id="1" w:name="_Hlk229477254"/>
       <w:r>
         <w:rPr>
           <w:rFonts w:ascii="Segoe UI" w:eastAsia="Times New Roman" w:hAnsi="Segoe UI" w:cs="Segoe UI"/>
@@ -2104,6 +2370,7 @@
         <w:t>6. Catatan Penting</w:t>
       </w:r>
     </w:p>
+    <w:bookmarkEnd w:id="1"/>
     <w:p>
       <w:pPr>
         <w:numPr>
@@ -2230,6 +2497,1106 @@
           <w:lang w:val="id-ID"/>
         </w:rPr>
         <w:t xml:space="preserve"> ke sisi Frontend (Javascript client-side). Request token harus selalu dilakukan dari server ERP.</w:t>
+      </w:r>
+    </w:p>
+    <w:p>
+      <w:pPr>
+        <w:rPr>
+          <w:rFonts w:ascii="Segoe UI" w:eastAsia="Times New Roman" w:hAnsi="Segoe UI" w:cs="Segoe UI"/>
+          <w:lang w:val="id-ID"/>
+        </w:rPr>
+      </w:pPr>
+    </w:p>
+    <w:p>
+      <w:pPr>
+        <w:rPr>
+          <w:rFonts w:ascii="Segoe UI" w:eastAsia="Times New Roman" w:hAnsi="Segoe UI" w:cs="Segoe UI"/>
+          <w:lang w:val="id-ID"/>
+        </w:rPr>
+      </w:pPr>
+    </w:p>
+    <w:p>
+      <w:pPr>
+        <w:rPr>
+          <w:rFonts w:ascii="Segoe UI" w:eastAsia="Times New Roman" w:hAnsi="Segoe UI" w:cs="Segoe UI"/>
+          <w:lang w:val="id-ID"/>
+        </w:rPr>
+      </w:pPr>
+    </w:p>
+    <w:p>
+      <w:pPr>
+        <w:rPr>
+          <w:rFonts w:ascii="Segoe UI" w:eastAsia="Times New Roman" w:hAnsi="Segoe UI" w:cs="Segoe UI"/>
+          <w:color w:val="333333"/>
+          <w:lang w:val="id-ID"/>
+        </w:rPr>
+      </w:pPr>
+    </w:p>
+    <w:p>
+      <w:pPr>
+        <w:pStyle w:val="Heading2"/>
+        <w:rPr>
+          <w:rFonts w:ascii="Segoe UI" w:eastAsia="Times New Roman" w:hAnsi="Segoe UI" w:cs="Segoe UI"/>
+          <w:lang w:val="id-ID"/>
+        </w:rPr>
+      </w:pPr>
+      <w:r>
+        <w:rPr>
+          <w:rFonts w:ascii="Segoe UI" w:eastAsia="Times New Roman" w:hAnsi="Segoe UI" w:cs="Segoe UI"/>
+          <w:lang w:val="id-ID"/>
+        </w:rPr>
+        <w:t>7</w:t>
+      </w:r>
+      <w:r>
+        <w:rPr>
+          <w:rFonts w:ascii="Segoe UI" w:eastAsia="Times New Roman" w:hAnsi="Segoe UI" w:cs="Segoe UI"/>
+          <w:lang w:val="id-ID"/>
+        </w:rPr>
+        <w:t xml:space="preserve">. </w:t>
+      </w:r>
+      <w:r>
+        <w:rPr>
+          <w:rFonts w:ascii="Segoe UI" w:eastAsia="Times New Roman" w:hAnsi="Segoe UI" w:cs="Segoe UI"/>
+          <w:lang w:val="id-ID"/>
+        </w:rPr>
+        <w:t>Contoh di JAVA Native dan Spring Boot</w:t>
+      </w:r>
+    </w:p>
+    <w:p>
+      <w:pPr>
+        <w:rPr>
+          <w:rFonts w:ascii="Segoe UI" w:eastAsia="Times New Roman" w:hAnsi="Segoe UI" w:cs="Segoe UI"/>
+          <w:lang w:val="id-ID"/>
+        </w:rPr>
+      </w:pPr>
+    </w:p>
+    <w:p>
+      <w:r>
+        <w:rPr>
+          <w:rFonts w:ascii="Segoe UI" w:eastAsia="Times New Roman" w:hAnsi="Segoe UI" w:cs="Segoe UI"/>
+          <w:lang w:val="id-ID"/>
+        </w:rPr>
+        <w:t>Java Native :</w:t>
+      </w:r>
+      <w:r>
+        <w:t xml:space="preserve"> </w:t>
+      </w:r>
+    </w:p>
+    <w:p>
+      <w:pPr>
+        <w:rPr>
+          <w:rFonts w:ascii="Segoe UI" w:eastAsia="Times New Roman" w:hAnsi="Segoe UI" w:cs="Segoe UI"/>
+          <w:lang w:val="id-ID"/>
+        </w:rPr>
+      </w:pPr>
+      <w:r>
+        <w:rPr>
+          <w:rFonts w:ascii="Segoe UI" w:eastAsia="Times New Roman" w:hAnsi="Segoe UI" w:cs="Segoe UI"/>
+          <w:lang w:val="id-ID"/>
+        </w:rPr>
+        <w:t>import org.springframework.http.*;</w:t>
+      </w:r>
+    </w:p>
+    <w:p>
+      <w:pPr>
+        <w:rPr>
+          <w:rFonts w:ascii="Segoe UI" w:eastAsia="Times New Roman" w:hAnsi="Segoe UI" w:cs="Segoe UI"/>
+          <w:lang w:val="id-ID"/>
+        </w:rPr>
+      </w:pPr>
+      <w:r>
+        <w:rPr>
+          <w:rFonts w:ascii="Segoe UI" w:eastAsia="Times New Roman" w:hAnsi="Segoe UI" w:cs="Segoe UI"/>
+          <w:lang w:val="id-ID"/>
+        </w:rPr>
+        <w:t>import org.springframework.web.client.RestTemplate;</w:t>
+      </w:r>
+    </w:p>
+    <w:p>
+      <w:pPr>
+        <w:rPr>
+          <w:rFonts w:ascii="Segoe UI" w:eastAsia="Times New Roman" w:hAnsi="Segoe UI" w:cs="Segoe UI"/>
+          <w:lang w:val="id-ID"/>
+        </w:rPr>
+      </w:pPr>
+      <w:r>
+        <w:rPr>
+          <w:rFonts w:ascii="Segoe UI" w:eastAsia="Times New Roman" w:hAnsi="Segoe UI" w:cs="Segoe UI"/>
+          <w:lang w:val="id-ID"/>
+        </w:rPr>
+        <w:t>import java.util.HashMap;</w:t>
+      </w:r>
+    </w:p>
+    <w:p>
+      <w:pPr>
+        <w:rPr>
+          <w:rFonts w:ascii="Segoe UI" w:eastAsia="Times New Roman" w:hAnsi="Segoe UI" w:cs="Segoe UI"/>
+          <w:lang w:val="id-ID"/>
+        </w:rPr>
+      </w:pPr>
+      <w:r>
+        <w:rPr>
+          <w:rFonts w:ascii="Segoe UI" w:eastAsia="Times New Roman" w:hAnsi="Segoe UI" w:cs="Segoe UI"/>
+          <w:lang w:val="id-ID"/>
+        </w:rPr>
+        <w:t>import java.util.Map;</w:t>
+      </w:r>
+    </w:p>
+    <w:p>
+      <w:pPr>
+        <w:rPr>
+          <w:rFonts w:ascii="Segoe UI" w:eastAsia="Times New Roman" w:hAnsi="Segoe UI" w:cs="Segoe UI"/>
+          <w:lang w:val="id-ID"/>
+        </w:rPr>
+      </w:pPr>
+    </w:p>
+    <w:p>
+      <w:pPr>
+        <w:rPr>
+          <w:rFonts w:ascii="Segoe UI" w:eastAsia="Times New Roman" w:hAnsi="Segoe UI" w:cs="Segoe UI"/>
+          <w:lang w:val="id-ID"/>
+        </w:rPr>
+      </w:pPr>
+      <w:r>
+        <w:rPr>
+          <w:rFonts w:ascii="Segoe UI" w:eastAsia="Times New Roman" w:hAnsi="Segoe UI" w:cs="Segoe UI"/>
+          <w:lang w:val="id-ID"/>
+        </w:rPr>
+        <w:t>public class SpringRequest {</w:t>
+      </w:r>
+    </w:p>
+    <w:p>
+      <w:pPr>
+        <w:rPr>
+          <w:rFonts w:ascii="Segoe UI" w:eastAsia="Times New Roman" w:hAnsi="Segoe UI" w:cs="Segoe UI"/>
+          <w:lang w:val="id-ID"/>
+        </w:rPr>
+      </w:pPr>
+    </w:p>
+    <w:p>
+      <w:pPr>
+        <w:rPr>
+          <w:rFonts w:ascii="Segoe UI" w:eastAsia="Times New Roman" w:hAnsi="Segoe UI" w:cs="Segoe UI"/>
+          <w:lang w:val="id-ID"/>
+        </w:rPr>
+      </w:pPr>
+      <w:r>
+        <w:rPr>
+          <w:rFonts w:ascii="Segoe UI" w:eastAsia="Times New Roman" w:hAnsi="Segoe UI" w:cs="Segoe UI"/>
+          <w:lang w:val="id-ID"/>
+        </w:rPr>
+        <w:t xml:space="preserve">    public void generateToken() {</w:t>
+      </w:r>
+    </w:p>
+    <w:p>
+      <w:pPr>
+        <w:rPr>
+          <w:rFonts w:ascii="Segoe UI" w:eastAsia="Times New Roman" w:hAnsi="Segoe UI" w:cs="Segoe UI"/>
+          <w:lang w:val="id-ID"/>
+        </w:rPr>
+      </w:pPr>
+      <w:r>
+        <w:rPr>
+          <w:rFonts w:ascii="Segoe UI" w:eastAsia="Times New Roman" w:hAnsi="Segoe UI" w:cs="Segoe UI"/>
+          <w:lang w:val="id-ID"/>
+        </w:rPr>
+        <w:t xml:space="preserve">        RestTemplate restTemplate = new RestTemplate();</w:t>
+      </w:r>
+    </w:p>
+    <w:p>
+      <w:pPr>
+        <w:rPr>
+          <w:rFonts w:ascii="Segoe UI" w:eastAsia="Times New Roman" w:hAnsi="Segoe UI" w:cs="Segoe UI"/>
+          <w:lang w:val="id-ID"/>
+        </w:rPr>
+      </w:pPr>
+      <w:r>
+        <w:rPr>
+          <w:rFonts w:ascii="Segoe UI" w:eastAsia="Times New Roman" w:hAnsi="Segoe UI" w:cs="Segoe UI"/>
+          <w:lang w:val="id-ID"/>
+        </w:rPr>
+        <w:t xml:space="preserve">        String url = "http://74.48.112.31:5000/api/sso/generate-token";</w:t>
+      </w:r>
+    </w:p>
+    <w:p>
+      <w:pPr>
+        <w:rPr>
+          <w:rFonts w:ascii="Segoe UI" w:eastAsia="Times New Roman" w:hAnsi="Segoe UI" w:cs="Segoe UI"/>
+          <w:lang w:val="id-ID"/>
+        </w:rPr>
+      </w:pPr>
+    </w:p>
+    <w:p>
+      <w:pPr>
+        <w:rPr>
+          <w:rFonts w:ascii="Segoe UI" w:eastAsia="Times New Roman" w:hAnsi="Segoe UI" w:cs="Segoe UI"/>
+          <w:lang w:val="id-ID"/>
+        </w:rPr>
+      </w:pPr>
+      <w:r>
+        <w:rPr>
+          <w:rFonts w:ascii="Segoe UI" w:eastAsia="Times New Roman" w:hAnsi="Segoe UI" w:cs="Segoe UI"/>
+          <w:lang w:val="id-ID"/>
+        </w:rPr>
+        <w:t xml:space="preserve">        // 1. Setup Header</w:t>
+      </w:r>
+    </w:p>
+    <w:p>
+      <w:pPr>
+        <w:rPr>
+          <w:rFonts w:ascii="Segoe UI" w:eastAsia="Times New Roman" w:hAnsi="Segoe UI" w:cs="Segoe UI"/>
+          <w:lang w:val="id-ID"/>
+        </w:rPr>
+      </w:pPr>
+      <w:r>
+        <w:rPr>
+          <w:rFonts w:ascii="Segoe UI" w:eastAsia="Times New Roman" w:hAnsi="Segoe UI" w:cs="Segoe UI"/>
+          <w:lang w:val="id-ID"/>
+        </w:rPr>
+        <w:t xml:space="preserve">        HttpHeaders headers = new HttpHeaders();</w:t>
+      </w:r>
+    </w:p>
+    <w:p>
+      <w:pPr>
+        <w:rPr>
+          <w:rFonts w:ascii="Segoe UI" w:eastAsia="Times New Roman" w:hAnsi="Segoe UI" w:cs="Segoe UI"/>
+          <w:lang w:val="id-ID"/>
+        </w:rPr>
+      </w:pPr>
+      <w:r>
+        <w:rPr>
+          <w:rFonts w:ascii="Segoe UI" w:eastAsia="Times New Roman" w:hAnsi="Segoe UI" w:cs="Segoe UI"/>
+          <w:lang w:val="id-ID"/>
+        </w:rPr>
+        <w:t xml:space="preserve">        headers.setContentType(MediaType.APPLICATION_JSON);</w:t>
+      </w:r>
+    </w:p>
+    <w:p>
+      <w:pPr>
+        <w:rPr>
+          <w:rFonts w:ascii="Segoe UI" w:eastAsia="Times New Roman" w:hAnsi="Segoe UI" w:cs="Segoe UI"/>
+          <w:lang w:val="id-ID"/>
+        </w:rPr>
+      </w:pPr>
+      <w:r>
+        <w:rPr>
+          <w:rFonts w:ascii="Segoe UI" w:eastAsia="Times New Roman" w:hAnsi="Segoe UI" w:cs="Segoe UI"/>
+          <w:lang w:val="id-ID"/>
+        </w:rPr>
+        <w:t xml:space="preserve">        headers.set("X-SSO-KEY", System.getenv("CHATBOT_SSO_KEY"));</w:t>
+      </w:r>
+    </w:p>
+    <w:p>
+      <w:pPr>
+        <w:rPr>
+          <w:rFonts w:ascii="Segoe UI" w:eastAsia="Times New Roman" w:hAnsi="Segoe UI" w:cs="Segoe UI"/>
+          <w:lang w:val="id-ID"/>
+        </w:rPr>
+      </w:pPr>
+      <w:r>
+        <w:rPr>
+          <w:rFonts w:ascii="Segoe UI" w:eastAsia="Times New Roman" w:hAnsi="Segoe UI" w:cs="Segoe UI"/>
+          <w:lang w:val="id-ID"/>
+        </w:rPr>
+        <w:lastRenderedPageBreak/>
+        <w:t xml:space="preserve">        headers.set("Accept", "application/json");</w:t>
+      </w:r>
+    </w:p>
+    <w:p>
+      <w:pPr>
+        <w:rPr>
+          <w:rFonts w:ascii="Segoe UI" w:eastAsia="Times New Roman" w:hAnsi="Segoe UI" w:cs="Segoe UI"/>
+          <w:lang w:val="id-ID"/>
+        </w:rPr>
+      </w:pPr>
+    </w:p>
+    <w:p>
+      <w:pPr>
+        <w:rPr>
+          <w:rFonts w:ascii="Segoe UI" w:eastAsia="Times New Roman" w:hAnsi="Segoe UI" w:cs="Segoe UI"/>
+          <w:lang w:val="id-ID"/>
+        </w:rPr>
+      </w:pPr>
+      <w:r>
+        <w:rPr>
+          <w:rFonts w:ascii="Segoe UI" w:eastAsia="Times New Roman" w:hAnsi="Segoe UI" w:cs="Segoe UI"/>
+          <w:lang w:val="id-ID"/>
+        </w:rPr>
+        <w:t xml:space="preserve">        // 2. Setup Body</w:t>
+      </w:r>
+    </w:p>
+    <w:p>
+      <w:pPr>
+        <w:rPr>
+          <w:rFonts w:ascii="Segoe UI" w:eastAsia="Times New Roman" w:hAnsi="Segoe UI" w:cs="Segoe UI"/>
+          <w:lang w:val="id-ID"/>
+        </w:rPr>
+      </w:pPr>
+      <w:r>
+        <w:rPr>
+          <w:rFonts w:ascii="Segoe UI" w:eastAsia="Times New Roman" w:hAnsi="Segoe UI" w:cs="Segoe UI"/>
+          <w:lang w:val="id-ID"/>
+        </w:rPr>
+        <w:t xml:space="preserve">        Map&lt;String, String&gt; map = new HashMap&lt;&gt;();</w:t>
+      </w:r>
+    </w:p>
+    <w:p>
+      <w:pPr>
+        <w:rPr>
+          <w:rFonts w:ascii="Segoe UI" w:eastAsia="Times New Roman" w:hAnsi="Segoe UI" w:cs="Segoe UI"/>
+          <w:lang w:val="id-ID"/>
+        </w:rPr>
+      </w:pPr>
+      <w:r>
+        <w:rPr>
+          <w:rFonts w:ascii="Segoe UI" w:eastAsia="Times New Roman" w:hAnsi="Segoe UI" w:cs="Segoe UI"/>
+          <w:lang w:val="id-ID"/>
+        </w:rPr>
+        <w:t xml:space="preserve">        map.put("email", "user@example.com");</w:t>
+      </w:r>
+    </w:p>
+    <w:p>
+      <w:pPr>
+        <w:rPr>
+          <w:rFonts w:ascii="Segoe UI" w:eastAsia="Times New Roman" w:hAnsi="Segoe UI" w:cs="Segoe UI"/>
+          <w:lang w:val="id-ID"/>
+        </w:rPr>
+      </w:pPr>
+      <w:r>
+        <w:rPr>
+          <w:rFonts w:ascii="Segoe UI" w:eastAsia="Times New Roman" w:hAnsi="Segoe UI" w:cs="Segoe UI"/>
+          <w:lang w:val="id-ID"/>
+        </w:rPr>
+        <w:t xml:space="preserve">        map.put("name", "Nama User");</w:t>
+      </w:r>
+    </w:p>
+    <w:p>
+      <w:pPr>
+        <w:rPr>
+          <w:rFonts w:ascii="Segoe UI" w:eastAsia="Times New Roman" w:hAnsi="Segoe UI" w:cs="Segoe UI"/>
+          <w:lang w:val="id-ID"/>
+        </w:rPr>
+      </w:pPr>
+    </w:p>
+    <w:p>
+      <w:pPr>
+        <w:rPr>
+          <w:rFonts w:ascii="Segoe UI" w:eastAsia="Times New Roman" w:hAnsi="Segoe UI" w:cs="Segoe UI"/>
+          <w:lang w:val="id-ID"/>
+        </w:rPr>
+      </w:pPr>
+      <w:r>
+        <w:rPr>
+          <w:rFonts w:ascii="Segoe UI" w:eastAsia="Times New Roman" w:hAnsi="Segoe UI" w:cs="Segoe UI"/>
+          <w:lang w:val="id-ID"/>
+        </w:rPr>
+        <w:t xml:space="preserve">        HttpEntity&lt;Map&lt;String, String&gt;&gt; entity = new HttpEntity&lt;&gt;(map, headers);</w:t>
+      </w:r>
+    </w:p>
+    <w:p>
+      <w:pPr>
+        <w:rPr>
+          <w:rFonts w:ascii="Segoe UI" w:eastAsia="Times New Roman" w:hAnsi="Segoe UI" w:cs="Segoe UI"/>
+          <w:lang w:val="id-ID"/>
+        </w:rPr>
+      </w:pPr>
+    </w:p>
+    <w:p>
+      <w:pPr>
+        <w:rPr>
+          <w:rFonts w:ascii="Segoe UI" w:eastAsia="Times New Roman" w:hAnsi="Segoe UI" w:cs="Segoe UI"/>
+          <w:lang w:val="id-ID"/>
+        </w:rPr>
+      </w:pPr>
+      <w:r>
+        <w:rPr>
+          <w:rFonts w:ascii="Segoe UI" w:eastAsia="Times New Roman" w:hAnsi="Segoe UI" w:cs="Segoe UI"/>
+          <w:lang w:val="id-ID"/>
+        </w:rPr>
+        <w:t xml:space="preserve">        // 3. Eksekusi POST</w:t>
+      </w:r>
+    </w:p>
+    <w:p>
+      <w:pPr>
+        <w:rPr>
+          <w:rFonts w:ascii="Segoe UI" w:eastAsia="Times New Roman" w:hAnsi="Segoe UI" w:cs="Segoe UI"/>
+          <w:lang w:val="id-ID"/>
+        </w:rPr>
+      </w:pPr>
+      <w:r>
+        <w:rPr>
+          <w:rFonts w:ascii="Segoe UI" w:eastAsia="Times New Roman" w:hAnsi="Segoe UI" w:cs="Segoe UI"/>
+          <w:lang w:val="id-ID"/>
+        </w:rPr>
+        <w:t xml:space="preserve">        ResponseEntity&lt;Map&gt; response = restTemplate.postForEntity(url, entity, Map.class);</w:t>
+      </w:r>
+    </w:p>
+    <w:p>
+      <w:pPr>
+        <w:rPr>
+          <w:rFonts w:ascii="Segoe UI" w:eastAsia="Times New Roman" w:hAnsi="Segoe UI" w:cs="Segoe UI"/>
+          <w:lang w:val="id-ID"/>
+        </w:rPr>
+      </w:pPr>
+    </w:p>
+    <w:p>
+      <w:pPr>
+        <w:rPr>
+          <w:rFonts w:ascii="Segoe UI" w:eastAsia="Times New Roman" w:hAnsi="Segoe UI" w:cs="Segoe UI"/>
+          <w:lang w:val="id-ID"/>
+        </w:rPr>
+      </w:pPr>
+      <w:r>
+        <w:rPr>
+          <w:rFonts w:ascii="Segoe UI" w:eastAsia="Times New Roman" w:hAnsi="Segoe UI" w:cs="Segoe UI"/>
+          <w:lang w:val="id-ID"/>
+        </w:rPr>
+        <w:t xml:space="preserve">        // 4. Ambil Token</w:t>
+      </w:r>
+    </w:p>
+    <w:p>
+      <w:pPr>
+        <w:rPr>
+          <w:rFonts w:ascii="Segoe UI" w:eastAsia="Times New Roman" w:hAnsi="Segoe UI" w:cs="Segoe UI"/>
+          <w:lang w:val="id-ID"/>
+        </w:rPr>
+      </w:pPr>
+      <w:r>
+        <w:rPr>
+          <w:rFonts w:ascii="Segoe UI" w:eastAsia="Times New Roman" w:hAnsi="Segoe UI" w:cs="Segoe UI"/>
+          <w:lang w:val="id-ID"/>
+        </w:rPr>
+        <w:t xml:space="preserve">        if (response.getStatusCode() == HttpStatus.OK) {</w:t>
+      </w:r>
+    </w:p>
+    <w:p>
+      <w:pPr>
+        <w:rPr>
+          <w:rFonts w:ascii="Segoe UI" w:eastAsia="Times New Roman" w:hAnsi="Segoe UI" w:cs="Segoe UI"/>
+          <w:lang w:val="id-ID"/>
+        </w:rPr>
+      </w:pPr>
+      <w:r>
+        <w:rPr>
+          <w:rFonts w:ascii="Segoe UI" w:eastAsia="Times New Roman" w:hAnsi="Segoe UI" w:cs="Segoe UI"/>
+          <w:lang w:val="id-ID"/>
+        </w:rPr>
+        <w:t xml:space="preserve">            Map&lt;String, Object&gt; body = response.getBody();</w:t>
+      </w:r>
+    </w:p>
+    <w:p>
+      <w:pPr>
+        <w:rPr>
+          <w:rFonts w:ascii="Segoe UI" w:eastAsia="Times New Roman" w:hAnsi="Segoe UI" w:cs="Segoe UI"/>
+          <w:lang w:val="id-ID"/>
+        </w:rPr>
+      </w:pPr>
+      <w:r>
+        <w:rPr>
+          <w:rFonts w:ascii="Segoe UI" w:eastAsia="Times New Roman" w:hAnsi="Segoe UI" w:cs="Segoe UI"/>
+          <w:lang w:val="id-ID"/>
+        </w:rPr>
+        <w:t xml:space="preserve">            String ottToken = (String) body.get("token");</w:t>
+      </w:r>
+    </w:p>
+    <w:p>
+      <w:pPr>
+        <w:rPr>
+          <w:rFonts w:ascii="Segoe UI" w:eastAsia="Times New Roman" w:hAnsi="Segoe UI" w:cs="Segoe UI"/>
+          <w:lang w:val="id-ID"/>
+        </w:rPr>
+      </w:pPr>
+      <w:r>
+        <w:rPr>
+          <w:rFonts w:ascii="Segoe UI" w:eastAsia="Times New Roman" w:hAnsi="Segoe UI" w:cs="Segoe UI"/>
+          <w:lang w:val="id-ID"/>
+        </w:rPr>
+        <w:t xml:space="preserve">            System.out.println("Token didapat: " + ottToken);</w:t>
+      </w:r>
+    </w:p>
+    <w:p>
+      <w:pPr>
+        <w:rPr>
+          <w:rFonts w:ascii="Segoe UI" w:eastAsia="Times New Roman" w:hAnsi="Segoe UI" w:cs="Segoe UI"/>
+          <w:lang w:val="id-ID"/>
+        </w:rPr>
+      </w:pPr>
+      <w:r>
+        <w:rPr>
+          <w:rFonts w:ascii="Segoe UI" w:eastAsia="Times New Roman" w:hAnsi="Segoe UI" w:cs="Segoe UI"/>
+          <w:lang w:val="id-ID"/>
+        </w:rPr>
+        <w:t xml:space="preserve">        }</w:t>
+      </w:r>
+    </w:p>
+    <w:p>
+      <w:pPr>
+        <w:rPr>
+          <w:rFonts w:ascii="Segoe UI" w:eastAsia="Times New Roman" w:hAnsi="Segoe UI" w:cs="Segoe UI"/>
+          <w:lang w:val="id-ID"/>
+        </w:rPr>
+      </w:pPr>
+      <w:r>
+        <w:rPr>
+          <w:rFonts w:ascii="Segoe UI" w:eastAsia="Times New Roman" w:hAnsi="Segoe UI" w:cs="Segoe UI"/>
+          <w:lang w:val="id-ID"/>
+        </w:rPr>
+        <w:t xml:space="preserve">    }</w:t>
+      </w:r>
+    </w:p>
+    <w:p>
+      <w:pPr>
+        <w:rPr>
+          <w:rFonts w:ascii="Segoe UI" w:eastAsia="Times New Roman" w:hAnsi="Segoe UI" w:cs="Segoe UI"/>
+          <w:lang w:val="id-ID"/>
+        </w:rPr>
+      </w:pPr>
+      <w:r>
+        <w:rPr>
+          <w:rFonts w:ascii="Segoe UI" w:eastAsia="Times New Roman" w:hAnsi="Segoe UI" w:cs="Segoe UI"/>
+          <w:lang w:val="id-ID"/>
+        </w:rPr>
+        <w:t>}</w:t>
+      </w:r>
+    </w:p>
+    <w:p>
+      <w:pPr>
+        <w:rPr>
+          <w:rFonts w:ascii="Segoe UI" w:eastAsia="Times New Roman" w:hAnsi="Segoe UI" w:cs="Segoe UI"/>
+          <w:lang w:val="id-ID"/>
+        </w:rPr>
+      </w:pPr>
+    </w:p>
+    <w:p>
+      <w:pPr>
+        <w:rPr>
+          <w:rFonts w:ascii="Segoe UI" w:eastAsia="Times New Roman" w:hAnsi="Segoe UI" w:cs="Segoe UI"/>
+          <w:lang w:val="id-ID"/>
+        </w:rPr>
+      </w:pPr>
+    </w:p>
+    <w:p>
+      <w:pPr>
+        <w:rPr>
+          <w:rFonts w:ascii="Segoe UI" w:eastAsia="Times New Roman" w:hAnsi="Segoe UI" w:cs="Segoe UI"/>
+          <w:lang w:val="id-ID"/>
+        </w:rPr>
+      </w:pPr>
+      <w:r>
+        <w:rPr>
+          <w:rFonts w:ascii="Segoe UI" w:eastAsia="Times New Roman" w:hAnsi="Segoe UI" w:cs="Segoe UI"/>
+          <w:lang w:val="id-ID"/>
+        </w:rPr>
+        <w:t>Java spring boot</w:t>
+      </w:r>
+    </w:p>
+    <w:p>
+      <w:pPr>
+        <w:rPr>
+          <w:rFonts w:ascii="Segoe UI" w:eastAsia="Times New Roman" w:hAnsi="Segoe UI" w:cs="Segoe UI"/>
+          <w:lang w:val="id-ID"/>
+        </w:rPr>
+      </w:pPr>
+    </w:p>
+    <w:p>
+      <w:pPr>
+        <w:rPr>
+          <w:rFonts w:ascii="Segoe UI" w:eastAsia="Times New Roman" w:hAnsi="Segoe UI" w:cs="Segoe UI"/>
+          <w:lang w:val="id-ID"/>
+        </w:rPr>
+      </w:pPr>
+    </w:p>
+    <w:p>
+      <w:pPr>
+        <w:rPr>
+          <w:rFonts w:ascii="Segoe UI" w:eastAsia="Times New Roman" w:hAnsi="Segoe UI" w:cs="Segoe UI"/>
+          <w:lang w:val="id-ID"/>
+        </w:rPr>
+      </w:pPr>
+    </w:p>
+    <w:p>
+      <w:pPr>
+        <w:rPr>
+          <w:rFonts w:ascii="Segoe UI" w:eastAsia="Times New Roman" w:hAnsi="Segoe UI" w:cs="Segoe UI"/>
+          <w:lang w:val="id-ID"/>
+        </w:rPr>
+      </w:pPr>
+    </w:p>
+    <w:p>
+      <w:pPr>
+        <w:rPr>
+          <w:rFonts w:ascii="Segoe UI" w:eastAsia="Times New Roman" w:hAnsi="Segoe UI" w:cs="Segoe UI"/>
+          <w:lang w:val="id-ID"/>
+        </w:rPr>
+      </w:pPr>
+      <w:r>
+        <w:rPr>
+          <w:rFonts w:ascii="Segoe UI" w:eastAsia="Times New Roman" w:hAnsi="Segoe UI" w:cs="Segoe UI"/>
+          <w:lang w:val="id-ID"/>
+        </w:rPr>
+        <w:t>import org.springframework.http.*;</w:t>
+      </w:r>
+    </w:p>
+    <w:p>
+      <w:pPr>
+        <w:rPr>
+          <w:rFonts w:ascii="Segoe UI" w:eastAsia="Times New Roman" w:hAnsi="Segoe UI" w:cs="Segoe UI"/>
+          <w:lang w:val="id-ID"/>
+        </w:rPr>
+      </w:pPr>
+      <w:r>
+        <w:rPr>
+          <w:rFonts w:ascii="Segoe UI" w:eastAsia="Times New Roman" w:hAnsi="Segoe UI" w:cs="Segoe UI"/>
+          <w:lang w:val="id-ID"/>
+        </w:rPr>
+        <w:t>import org.springframework.web.client.RestTemplate;</w:t>
+      </w:r>
+    </w:p>
+    <w:p>
+      <w:pPr>
+        <w:rPr>
+          <w:rFonts w:ascii="Segoe UI" w:eastAsia="Times New Roman" w:hAnsi="Segoe UI" w:cs="Segoe UI"/>
+          <w:lang w:val="id-ID"/>
+        </w:rPr>
+      </w:pPr>
+      <w:r>
+        <w:rPr>
+          <w:rFonts w:ascii="Segoe UI" w:eastAsia="Times New Roman" w:hAnsi="Segoe UI" w:cs="Segoe UI"/>
+          <w:lang w:val="id-ID"/>
+        </w:rPr>
+        <w:t>import java.util.HashMap;</w:t>
+      </w:r>
+    </w:p>
+    <w:p>
+      <w:pPr>
+        <w:rPr>
+          <w:rFonts w:ascii="Segoe UI" w:eastAsia="Times New Roman" w:hAnsi="Segoe UI" w:cs="Segoe UI"/>
+          <w:lang w:val="id-ID"/>
+        </w:rPr>
+      </w:pPr>
+      <w:r>
+        <w:rPr>
+          <w:rFonts w:ascii="Segoe UI" w:eastAsia="Times New Roman" w:hAnsi="Segoe UI" w:cs="Segoe UI"/>
+          <w:lang w:val="id-ID"/>
+        </w:rPr>
+        <w:t>import java.util.Map;</w:t>
+      </w:r>
+    </w:p>
+    <w:p>
+      <w:pPr>
+        <w:rPr>
+          <w:rFonts w:ascii="Segoe UI" w:eastAsia="Times New Roman" w:hAnsi="Segoe UI" w:cs="Segoe UI"/>
+          <w:lang w:val="id-ID"/>
+        </w:rPr>
+      </w:pPr>
+    </w:p>
+    <w:p>
+      <w:pPr>
+        <w:rPr>
+          <w:rFonts w:ascii="Segoe UI" w:eastAsia="Times New Roman" w:hAnsi="Segoe UI" w:cs="Segoe UI"/>
+          <w:lang w:val="id-ID"/>
+        </w:rPr>
+      </w:pPr>
+      <w:r>
+        <w:rPr>
+          <w:rFonts w:ascii="Segoe UI" w:eastAsia="Times New Roman" w:hAnsi="Segoe UI" w:cs="Segoe UI"/>
+          <w:lang w:val="id-ID"/>
+        </w:rPr>
+        <w:t>public class SpringRequest {</w:t>
+      </w:r>
+    </w:p>
+    <w:p>
+      <w:pPr>
+        <w:rPr>
+          <w:rFonts w:ascii="Segoe UI" w:eastAsia="Times New Roman" w:hAnsi="Segoe UI" w:cs="Segoe UI"/>
+          <w:lang w:val="id-ID"/>
+        </w:rPr>
+      </w:pPr>
+    </w:p>
+    <w:p>
+      <w:pPr>
+        <w:rPr>
+          <w:rFonts w:ascii="Segoe UI" w:eastAsia="Times New Roman" w:hAnsi="Segoe UI" w:cs="Segoe UI"/>
+          <w:lang w:val="id-ID"/>
+        </w:rPr>
+      </w:pPr>
+      <w:r>
+        <w:rPr>
+          <w:rFonts w:ascii="Segoe UI" w:eastAsia="Times New Roman" w:hAnsi="Segoe UI" w:cs="Segoe UI"/>
+          <w:lang w:val="id-ID"/>
+        </w:rPr>
+        <w:t xml:space="preserve">    public void generateToken() {</w:t>
+      </w:r>
+    </w:p>
+    <w:p>
+      <w:pPr>
+        <w:rPr>
+          <w:rFonts w:ascii="Segoe UI" w:eastAsia="Times New Roman" w:hAnsi="Segoe UI" w:cs="Segoe UI"/>
+          <w:lang w:val="id-ID"/>
+        </w:rPr>
+      </w:pPr>
+      <w:r>
+        <w:rPr>
+          <w:rFonts w:ascii="Segoe UI" w:eastAsia="Times New Roman" w:hAnsi="Segoe UI" w:cs="Segoe UI"/>
+          <w:lang w:val="id-ID"/>
+        </w:rPr>
+        <w:t xml:space="preserve">        RestTemplate restTemplate = new RestTemplate();</w:t>
+      </w:r>
+    </w:p>
+    <w:p>
+      <w:pPr>
+        <w:rPr>
+          <w:rFonts w:ascii="Segoe UI" w:eastAsia="Times New Roman" w:hAnsi="Segoe UI" w:cs="Segoe UI"/>
+          <w:lang w:val="id-ID"/>
+        </w:rPr>
+      </w:pPr>
+      <w:r>
+        <w:rPr>
+          <w:rFonts w:ascii="Segoe UI" w:eastAsia="Times New Roman" w:hAnsi="Segoe UI" w:cs="Segoe UI"/>
+          <w:lang w:val="id-ID"/>
+        </w:rPr>
+        <w:t xml:space="preserve">        String url = "http://74.48.112.31:5000/api/sso/generate-token";</w:t>
+      </w:r>
+    </w:p>
+    <w:p>
+      <w:pPr>
+        <w:rPr>
+          <w:rFonts w:ascii="Segoe UI" w:eastAsia="Times New Roman" w:hAnsi="Segoe UI" w:cs="Segoe UI"/>
+          <w:lang w:val="id-ID"/>
+        </w:rPr>
+      </w:pPr>
+    </w:p>
+    <w:p>
+      <w:pPr>
+        <w:rPr>
+          <w:rFonts w:ascii="Segoe UI" w:eastAsia="Times New Roman" w:hAnsi="Segoe UI" w:cs="Segoe UI"/>
+          <w:lang w:val="id-ID"/>
+        </w:rPr>
+      </w:pPr>
+      <w:r>
+        <w:rPr>
+          <w:rFonts w:ascii="Segoe UI" w:eastAsia="Times New Roman" w:hAnsi="Segoe UI" w:cs="Segoe UI"/>
+          <w:lang w:val="id-ID"/>
+        </w:rPr>
+        <w:t xml:space="preserve">        // 1. Setup Header</w:t>
+      </w:r>
+    </w:p>
+    <w:p>
+      <w:pPr>
+        <w:rPr>
+          <w:rFonts w:ascii="Segoe UI" w:eastAsia="Times New Roman" w:hAnsi="Segoe UI" w:cs="Segoe UI"/>
+          <w:lang w:val="id-ID"/>
+        </w:rPr>
+      </w:pPr>
+      <w:r>
+        <w:rPr>
+          <w:rFonts w:ascii="Segoe UI" w:eastAsia="Times New Roman" w:hAnsi="Segoe UI" w:cs="Segoe UI"/>
+          <w:lang w:val="id-ID"/>
+        </w:rPr>
+        <w:lastRenderedPageBreak/>
+        <w:t xml:space="preserve">        HttpHeaders headers = new HttpHeaders();</w:t>
+      </w:r>
+    </w:p>
+    <w:p>
+      <w:pPr>
+        <w:rPr>
+          <w:rFonts w:ascii="Segoe UI" w:eastAsia="Times New Roman" w:hAnsi="Segoe UI" w:cs="Segoe UI"/>
+          <w:lang w:val="id-ID"/>
+        </w:rPr>
+      </w:pPr>
+      <w:r>
+        <w:rPr>
+          <w:rFonts w:ascii="Segoe UI" w:eastAsia="Times New Roman" w:hAnsi="Segoe UI" w:cs="Segoe UI"/>
+          <w:lang w:val="id-ID"/>
+        </w:rPr>
+        <w:t xml:space="preserve">        headers.setContentType(MediaType.APPLICATION_JSON);</w:t>
+      </w:r>
+    </w:p>
+    <w:p>
+      <w:pPr>
+        <w:rPr>
+          <w:rFonts w:ascii="Segoe UI" w:eastAsia="Times New Roman" w:hAnsi="Segoe UI" w:cs="Segoe UI"/>
+          <w:lang w:val="id-ID"/>
+        </w:rPr>
+      </w:pPr>
+      <w:r>
+        <w:rPr>
+          <w:rFonts w:ascii="Segoe UI" w:eastAsia="Times New Roman" w:hAnsi="Segoe UI" w:cs="Segoe UI"/>
+          <w:lang w:val="id-ID"/>
+        </w:rPr>
+        <w:t xml:space="preserve">        headers.set("X-SSO-KEY", System.getenv("CHATBOT_SSO_KEY"));</w:t>
+      </w:r>
+    </w:p>
+    <w:p>
+      <w:pPr>
+        <w:rPr>
+          <w:rFonts w:ascii="Segoe UI" w:eastAsia="Times New Roman" w:hAnsi="Segoe UI" w:cs="Segoe UI"/>
+          <w:lang w:val="id-ID"/>
+        </w:rPr>
+      </w:pPr>
+      <w:r>
+        <w:rPr>
+          <w:rFonts w:ascii="Segoe UI" w:eastAsia="Times New Roman" w:hAnsi="Segoe UI" w:cs="Segoe UI"/>
+          <w:lang w:val="id-ID"/>
+        </w:rPr>
+        <w:t xml:space="preserve">        headers.set("Accept", "application/json");</w:t>
+      </w:r>
+    </w:p>
+    <w:p>
+      <w:pPr>
+        <w:rPr>
+          <w:rFonts w:ascii="Segoe UI" w:eastAsia="Times New Roman" w:hAnsi="Segoe UI" w:cs="Segoe UI"/>
+          <w:lang w:val="id-ID"/>
+        </w:rPr>
+      </w:pPr>
+    </w:p>
+    <w:p>
+      <w:pPr>
+        <w:rPr>
+          <w:rFonts w:ascii="Segoe UI" w:eastAsia="Times New Roman" w:hAnsi="Segoe UI" w:cs="Segoe UI"/>
+          <w:lang w:val="id-ID"/>
+        </w:rPr>
+      </w:pPr>
+      <w:r>
+        <w:rPr>
+          <w:rFonts w:ascii="Segoe UI" w:eastAsia="Times New Roman" w:hAnsi="Segoe UI" w:cs="Segoe UI"/>
+          <w:lang w:val="id-ID"/>
+        </w:rPr>
+        <w:t xml:space="preserve">        // 2. Setup Body</w:t>
+      </w:r>
+    </w:p>
+    <w:p>
+      <w:pPr>
+        <w:rPr>
+          <w:rFonts w:ascii="Segoe UI" w:eastAsia="Times New Roman" w:hAnsi="Segoe UI" w:cs="Segoe UI"/>
+          <w:lang w:val="id-ID"/>
+        </w:rPr>
+      </w:pPr>
+      <w:r>
+        <w:rPr>
+          <w:rFonts w:ascii="Segoe UI" w:eastAsia="Times New Roman" w:hAnsi="Segoe UI" w:cs="Segoe UI"/>
+          <w:lang w:val="id-ID"/>
+        </w:rPr>
+        <w:t xml:space="preserve">        Map&lt;String, String&gt; map = new HashMap&lt;&gt;();</w:t>
+      </w:r>
+    </w:p>
+    <w:p>
+      <w:pPr>
+        <w:rPr>
+          <w:rFonts w:ascii="Segoe UI" w:eastAsia="Times New Roman" w:hAnsi="Segoe UI" w:cs="Segoe UI"/>
+          <w:lang w:val="id-ID"/>
+        </w:rPr>
+      </w:pPr>
+      <w:r>
+        <w:rPr>
+          <w:rFonts w:ascii="Segoe UI" w:eastAsia="Times New Roman" w:hAnsi="Segoe UI" w:cs="Segoe UI"/>
+          <w:lang w:val="id-ID"/>
+        </w:rPr>
+        <w:t xml:space="preserve">        map.put("email", "user@example.com");</w:t>
+      </w:r>
+    </w:p>
+    <w:p>
+      <w:pPr>
+        <w:rPr>
+          <w:rFonts w:ascii="Segoe UI" w:eastAsia="Times New Roman" w:hAnsi="Segoe UI" w:cs="Segoe UI"/>
+          <w:lang w:val="id-ID"/>
+        </w:rPr>
+      </w:pPr>
+      <w:r>
+        <w:rPr>
+          <w:rFonts w:ascii="Segoe UI" w:eastAsia="Times New Roman" w:hAnsi="Segoe UI" w:cs="Segoe UI"/>
+          <w:lang w:val="id-ID"/>
+        </w:rPr>
+        <w:t xml:space="preserve">        map.put("name", "Nama User");</w:t>
+      </w:r>
+    </w:p>
+    <w:p>
+      <w:pPr>
+        <w:rPr>
+          <w:rFonts w:ascii="Segoe UI" w:eastAsia="Times New Roman" w:hAnsi="Segoe UI" w:cs="Segoe UI"/>
+          <w:lang w:val="id-ID"/>
+        </w:rPr>
+      </w:pPr>
+    </w:p>
+    <w:p>
+      <w:pPr>
+        <w:rPr>
+          <w:rFonts w:ascii="Segoe UI" w:eastAsia="Times New Roman" w:hAnsi="Segoe UI" w:cs="Segoe UI"/>
+          <w:lang w:val="id-ID"/>
+        </w:rPr>
+      </w:pPr>
+      <w:r>
+        <w:rPr>
+          <w:rFonts w:ascii="Segoe UI" w:eastAsia="Times New Roman" w:hAnsi="Segoe UI" w:cs="Segoe UI"/>
+          <w:lang w:val="id-ID"/>
+        </w:rPr>
+        <w:t xml:space="preserve">        HttpEntity&lt;Map&lt;String, String&gt;&gt; entity = new HttpEntity&lt;&gt;(map, headers);</w:t>
+      </w:r>
+    </w:p>
+    <w:p>
+      <w:pPr>
+        <w:rPr>
+          <w:rFonts w:ascii="Segoe UI" w:eastAsia="Times New Roman" w:hAnsi="Segoe UI" w:cs="Segoe UI"/>
+          <w:lang w:val="id-ID"/>
+        </w:rPr>
+      </w:pPr>
+    </w:p>
+    <w:p>
+      <w:pPr>
+        <w:rPr>
+          <w:rFonts w:ascii="Segoe UI" w:eastAsia="Times New Roman" w:hAnsi="Segoe UI" w:cs="Segoe UI"/>
+          <w:lang w:val="id-ID"/>
+        </w:rPr>
+      </w:pPr>
+      <w:r>
+        <w:rPr>
+          <w:rFonts w:ascii="Segoe UI" w:eastAsia="Times New Roman" w:hAnsi="Segoe UI" w:cs="Segoe UI"/>
+          <w:lang w:val="id-ID"/>
+        </w:rPr>
+        <w:t xml:space="preserve">        // 3. Eksekusi POST</w:t>
+      </w:r>
+    </w:p>
+    <w:p>
+      <w:pPr>
+        <w:rPr>
+          <w:rFonts w:ascii="Segoe UI" w:eastAsia="Times New Roman" w:hAnsi="Segoe UI" w:cs="Segoe UI"/>
+          <w:lang w:val="id-ID"/>
+        </w:rPr>
+      </w:pPr>
+      <w:r>
+        <w:rPr>
+          <w:rFonts w:ascii="Segoe UI" w:eastAsia="Times New Roman" w:hAnsi="Segoe UI" w:cs="Segoe UI"/>
+          <w:lang w:val="id-ID"/>
+        </w:rPr>
+        <w:t xml:space="preserve">        ResponseEntity&lt;Map&gt; response = restTemplate.postForEntity(url, entity, Map.class);</w:t>
+      </w:r>
+    </w:p>
+    <w:p>
+      <w:pPr>
+        <w:rPr>
+          <w:rFonts w:ascii="Segoe UI" w:eastAsia="Times New Roman" w:hAnsi="Segoe UI" w:cs="Segoe UI"/>
+          <w:lang w:val="id-ID"/>
+        </w:rPr>
+      </w:pPr>
+    </w:p>
+    <w:p>
+      <w:pPr>
+        <w:rPr>
+          <w:rFonts w:ascii="Segoe UI" w:eastAsia="Times New Roman" w:hAnsi="Segoe UI" w:cs="Segoe UI"/>
+          <w:lang w:val="id-ID"/>
+        </w:rPr>
+      </w:pPr>
+      <w:r>
+        <w:rPr>
+          <w:rFonts w:ascii="Segoe UI" w:eastAsia="Times New Roman" w:hAnsi="Segoe UI" w:cs="Segoe UI"/>
+          <w:lang w:val="id-ID"/>
+        </w:rPr>
+        <w:t xml:space="preserve">        // 4. Ambil Token</w:t>
+      </w:r>
+    </w:p>
+    <w:p>
+      <w:pPr>
+        <w:rPr>
+          <w:rFonts w:ascii="Segoe UI" w:eastAsia="Times New Roman" w:hAnsi="Segoe UI" w:cs="Segoe UI"/>
+          <w:lang w:val="id-ID"/>
+        </w:rPr>
+      </w:pPr>
+      <w:r>
+        <w:rPr>
+          <w:rFonts w:ascii="Segoe UI" w:eastAsia="Times New Roman" w:hAnsi="Segoe UI" w:cs="Segoe UI"/>
+          <w:lang w:val="id-ID"/>
+        </w:rPr>
+        <w:t xml:space="preserve">        if (response.getStatusCode() == HttpStatus.OK) {</w:t>
+      </w:r>
+    </w:p>
+    <w:p>
+      <w:pPr>
+        <w:rPr>
+          <w:rFonts w:ascii="Segoe UI" w:eastAsia="Times New Roman" w:hAnsi="Segoe UI" w:cs="Segoe UI"/>
+          <w:lang w:val="id-ID"/>
+        </w:rPr>
+      </w:pPr>
+      <w:r>
+        <w:rPr>
+          <w:rFonts w:ascii="Segoe UI" w:eastAsia="Times New Roman" w:hAnsi="Segoe UI" w:cs="Segoe UI"/>
+          <w:lang w:val="id-ID"/>
+        </w:rPr>
+        <w:t xml:space="preserve">            Map&lt;String, Object&gt; body = response.getBody();</w:t>
+      </w:r>
+    </w:p>
+    <w:p>
+      <w:pPr>
+        <w:rPr>
+          <w:rFonts w:ascii="Segoe UI" w:eastAsia="Times New Roman" w:hAnsi="Segoe UI" w:cs="Segoe UI"/>
+          <w:lang w:val="id-ID"/>
+        </w:rPr>
+      </w:pPr>
+      <w:r>
+        <w:rPr>
+          <w:rFonts w:ascii="Segoe UI" w:eastAsia="Times New Roman" w:hAnsi="Segoe UI" w:cs="Segoe UI"/>
+          <w:lang w:val="id-ID"/>
+        </w:rPr>
+        <w:t xml:space="preserve">            String ottToken = (String) body.get("token");</w:t>
+      </w:r>
+    </w:p>
+    <w:p>
+      <w:pPr>
+        <w:rPr>
+          <w:rFonts w:ascii="Segoe UI" w:eastAsia="Times New Roman" w:hAnsi="Segoe UI" w:cs="Segoe UI"/>
+          <w:lang w:val="id-ID"/>
+        </w:rPr>
+      </w:pPr>
+      <w:r>
+        <w:rPr>
+          <w:rFonts w:ascii="Segoe UI" w:eastAsia="Times New Roman" w:hAnsi="Segoe UI" w:cs="Segoe UI"/>
+          <w:lang w:val="id-ID"/>
+        </w:rPr>
+        <w:t xml:space="preserve">            System.out.println("Token didapat: " + ottToken);</w:t>
+      </w:r>
+    </w:p>
+    <w:p>
+      <w:pPr>
+        <w:rPr>
+          <w:rFonts w:ascii="Segoe UI" w:eastAsia="Times New Roman" w:hAnsi="Segoe UI" w:cs="Segoe UI"/>
+          <w:lang w:val="id-ID"/>
+        </w:rPr>
+      </w:pPr>
+      <w:r>
+        <w:rPr>
+          <w:rFonts w:ascii="Segoe UI" w:eastAsia="Times New Roman" w:hAnsi="Segoe UI" w:cs="Segoe UI"/>
+          <w:lang w:val="id-ID"/>
+        </w:rPr>
+        <w:t xml:space="preserve">        }</w:t>
+      </w:r>
+    </w:p>
+    <w:p>
+      <w:pPr>
+        <w:rPr>
+          <w:rFonts w:ascii="Segoe UI" w:eastAsia="Times New Roman" w:hAnsi="Segoe UI" w:cs="Segoe UI"/>
+          <w:lang w:val="id-ID"/>
+        </w:rPr>
+      </w:pPr>
+      <w:r>
+        <w:rPr>
+          <w:rFonts w:ascii="Segoe UI" w:eastAsia="Times New Roman" w:hAnsi="Segoe UI" w:cs="Segoe UI"/>
+          <w:lang w:val="id-ID"/>
+        </w:rPr>
+        <w:t xml:space="preserve">    }</w:t>
+      </w:r>
+    </w:p>
+    <w:p>
+      <w:pPr>
+        <w:rPr>
+          <w:rFonts w:ascii="Segoe UI" w:eastAsia="Times New Roman" w:hAnsi="Segoe UI" w:cs="Segoe UI"/>
+          <w:lang w:val="id-ID"/>
+        </w:rPr>
+      </w:pPr>
+      <w:r>
+        <w:rPr>
+          <w:rFonts w:ascii="Segoe UI" w:eastAsia="Times New Roman" w:hAnsi="Segoe UI" w:cs="Segoe UI"/>
+          <w:lang w:val="id-ID"/>
+        </w:rPr>
+        <w:t>}</w:t>
       </w:r>
     </w:p>
     <w:sectPr>

</xml_diff>